<commit_message>
Finalize Caixa Cheia v4 — fleet fixes, self-service layer, BMC
Apply all 22 review-fleet fixes (CPC 47 exclusion restored, opt-in
scope field, Anexo V tax correction, webhook auth, WhatsApp webhook
receiver, charge idempotency, scan-message compliance, date and
consistency fixes). Add the self-service onboarding layer (15-minute
flow, 100+ salons/month throughput, two-tier motion) and the one-table
Business Model Canvas.

Co-Authored-By: Claude Fable 5 <noreply@anthropic.com>
Claude-Session: https://claude.ai/code/session_014mavYpYo1uVZXnrTYH94be
</commit_message>
<xml_diff>
--- a/CAIXA_CHEIA_V4.docx
+++ b/CAIXA_CHEIA_V4.docx
@@ -470,7 +470,7 @@
                 <w:sz w:val="22"/>
                 <w:szCs w:val="22"/>
               </w:rPr>
-              <w:t xml:space="preserve">Eligibility scan: send the Trinks CSV, get back “612 clientes sumidas elegíveis · potencial R$X” in an hour — same importer as the product, zero extra machinery</w:t>
+              <w:t xml:space="preserve">Eligibility scan: send the Trinks CSV, get back “612 elegíveis · 214 com opt-in comprovado · potencial R$X” in an hour — same importer as the product, zero extra machinery</w:t>
             </w:r>
           </w:p>
         </w:tc>
@@ -499,7 +499,7 @@
                 <w:sz w:val="22"/>
                 <w:szCs w:val="22"/>
               </w:rPr>
-              <w:t xml:space="preserve">Fee</w:t>
+              <w:t xml:space="preserve">Onboarding</w:t>
             </w:r>
           </w:p>
         </w:tc>
@@ -523,7 +523,7 @@
                 <w:sz w:val="22"/>
                 <w:szCs w:val="22"/>
               </w:rPr>
-              <w:t xml:space="preserve">20% of Asaas netValue actually settled through the campaign checkout · refunds reverse the fee · first 3 clients at 15% for testimonials</w:t>
+              <w:t xml:space="preserve">Fully self-service for the owner: sign up, upload CSV, clickwrap contract+DPA, guided Asaas connect, Meta embedded-signup for WhatsApp, pick an offer from the gallery, approve — ~15 minutes once, then two taps per campaign. Zero founder minutes on the happy path; built for 100+ new salons/month.</w:t>
             </w:r>
           </w:p>
         </w:tc>
@@ -552,7 +552,7 @@
                 <w:sz w:val="22"/>
                 <w:szCs w:val="22"/>
               </w:rPr>
-              <w:t xml:space="preserve">Attribution</w:t>
+              <w:t xml:space="preserve">Fee</w:t>
             </w:r>
           </w:p>
         </w:tc>
@@ -576,7 +576,7 @@
                 <w:sz w:val="22"/>
                 <w:szCs w:val="22"/>
               </w:rPr>
-              <w:t xml:space="preserve">Only money paid through the campaign link. A R$100 deposit on a R$500 service earns fee on R$100. No agenda reconciliation, no bypass invoices, ever.</w:t>
+              <w:t xml:space="preserve">20% of Asaas netValue actually settled through the campaign checkout · refunds reverse the fee · first 3 clients at 15% for testimonials</w:t>
             </w:r>
           </w:p>
         </w:tc>
@@ -605,7 +605,7 @@
                 <w:sz w:val="22"/>
                 <w:szCs w:val="22"/>
               </w:rPr>
-              <w:t xml:space="preserve">Sending</w:t>
+              <w:t xml:space="preserve">Attribution</w:t>
             </w:r>
           </w:p>
         </w:tc>
@@ -629,7 +629,7 @@
                 <w:sz w:val="22"/>
                 <w:szCs w:val="22"/>
               </w:rPr>
-              <w:t xml:space="preserve">One mode: WhatsApp Cloud API with Business-App coexistence, on the salon’s own number. One approved template family per salon, written in her tone, deterministic variables.</w:t>
+              <w:t xml:space="preserve">Only money paid through the campaign link. A R$100 deposit on a R$500 service earns fee on R$100. No agenda reconciliation, no bypass invoices, ever.</w:t>
             </w:r>
           </w:p>
         </w:tc>
@@ -658,7 +658,7 @@
                 <w:sz w:val="22"/>
                 <w:szCs w:val="22"/>
               </w:rPr>
-              <w:t xml:space="preserve">Consent</w:t>
+              <w:t xml:space="preserve">Sending</w:t>
             </w:r>
           </w:p>
         </w:tc>
@@ -682,7 +682,7 @@
                 <w:sz w:val="22"/>
                 <w:szCs w:val="22"/>
               </w:rPr>
-              <w:t xml:space="preserve">The opt-in evidence gate: no documented marketing opt-in (value + captured_at + source) = no send. No exceptions.</w:t>
+              <w:t xml:space="preserve">One mode: WhatsApp Cloud API with Business-App coexistence, on the salon’s own number. One approved template family per salon, written in her tone, deterministic variables.</w:t>
             </w:r>
           </w:p>
         </w:tc>
@@ -711,7 +711,7 @@
                 <w:sz w:val="22"/>
                 <w:szCs w:val="22"/>
               </w:rPr>
-              <w:t xml:space="preserve">Approval</w:t>
+              <w:t xml:space="preserve">Consent</w:t>
             </w:r>
           </w:p>
         </w:tc>
@@ -735,7 +735,7 @@
                 <w:sz w:val="22"/>
                 <w:szCs w:val="22"/>
               </w:rPr>
-              <w:t xml:space="preserve">The owner approves the exact final send manifest (recipients, copy, links); manifest + approver + timestamp + hash stored. Nothing changes after approval.</w:t>
+              <w:t xml:space="preserve">The opt-in evidence gate: no documented marketing opt-in (value + captured_at + source + scope) = no send. No exceptions.</w:t>
             </w:r>
           </w:p>
         </w:tc>
@@ -764,7 +764,7 @@
                 <w:sz w:val="22"/>
                 <w:szCs w:val="22"/>
               </w:rPr>
-              <w:t xml:space="preserve">Payment</w:t>
+              <w:t xml:space="preserve">Approval</w:t>
             </w:r>
           </w:p>
         </w:tc>
@@ -788,7 +788,7 @@
                 <w:sz w:val="22"/>
                 <w:szCs w:val="22"/>
               </w:rPr>
-              <w:t xml:space="preserve">Salon-owned Asaas account; automatic split routes the 20% at settlement. She never holds a centavo of anyone else’s money. NFS-e still issued for every fee.</w:t>
+              <w:t xml:space="preserve">The owner approves the exact final send manifest (recipients, rendered copy, links); manifest + approver + timestamp + hash stored. Nothing changes after approval.</w:t>
             </w:r>
           </w:p>
         </w:tc>
@@ -817,6 +817,59 @@
                 <w:sz w:val="22"/>
                 <w:szCs w:val="22"/>
               </w:rPr>
+              <w:t xml:space="preserve">Payment</w:t>
+            </w:r>
+          </w:p>
+        </w:tc>
+        <w:tc>
+          <w:tcPr>
+            <w:tcW w:type="dxa" w:w="7460"/>
+            <w:tcMar>
+              <w:top w:type="dxa" w:w="90"/>
+              <w:left w:type="dxa" w:w="140"/>
+              <w:bottom w:type="dxa" w:w="90"/>
+              <w:right w:type="dxa" w:w="140"/>
+            </w:tcMar>
+          </w:tcPr>
+          <w:p>
+            <w:pPr>
+              <w:spacing w:after="0" w:line="300"/>
+            </w:pPr>
+            <w:r>
+              <w:rPr>
+                <w:color w:val="141414"/>
+                <w:sz w:val="22"/>
+                <w:szCs w:val="22"/>
+              </w:rPr>
+              <w:t xml:space="preserve">Salon-owned Asaas account; automatic split routes the 20% at settlement. She never holds a centavo of anyone else’s money. NFS-e still issued for every fee.</w:t>
+            </w:r>
+          </w:p>
+        </w:tc>
+      </w:tr>
+      <w:tr>
+        <w:trPr>
+          <w:tblHeader w:val="false"/>
+        </w:trPr>
+        <w:tc>
+          <w:tcPr>
+            <w:tcW w:type="dxa" w:w="1900"/>
+            <w:tcMar>
+              <w:top w:type="dxa" w:w="90"/>
+              <w:left w:type="dxa" w:w="140"/>
+              <w:bottom w:type="dxa" w:w="90"/>
+              <w:right w:type="dxa" w:w="140"/>
+            </w:tcMar>
+          </w:tcPr>
+          <w:p>
+            <w:pPr>
+              <w:spacing w:after="0" w:line="300"/>
+            </w:pPr>
+            <w:r>
+              <w:rPr>
+                <w:color w:val="141414"/>
+                <w:sz w:val="22"/>
+                <w:szCs w:val="22"/>
+              </w:rPr>
               <w:t xml:space="preserve">Revenue shape</w:t>
             </w:r>
           </w:p>
@@ -841,7 +894,7 @@
                 <w:sz w:val="22"/>
                 <w:szCs w:val="22"/>
               </w:rPr>
-              <w:t xml:space="preserve">A campaign factory — backlog harvest, then quarterly/seasonal re-runs. Not MRR, and never pretended to be.</w:t>
+              <w:t xml:space="preserve">A campaign factory — backlog harvest, then quarterly/seasonal re-runs. Not MRR — v4 stops pretending otherwise.</w:t>
             </w:r>
           </w:p>
         </w:tc>
@@ -908,6 +961,578 @@
     </w:p>
     <w:p>
       <w:pPr>
+        <w:pStyle w:val="Heading3"/>
+        <w:spacing w:after="120" w:before="220"/>
+      </w:pPr>
+      <w:r>
+        <w:rPr>
+          <w:b/>
+          <w:bCs/>
+          <w:color w:val="141414"/>
+        </w:rPr>
+        <w:t xml:space="preserve">The business model canvas — one table</w:t>
+      </w:r>
+    </w:p>
+    <w:tbl>
+      <w:tblPr>
+        <w:tblW w:type="dxa" w:w="9360"/>
+        <w:tblBorders>
+          <w:top w:val="single" w:color="1D6B4F" w:sz="8"/>
+          <w:left w:val="none"/>
+          <w:bottom w:val="single" w:color="1D6B4F" w:sz="8"/>
+          <w:right w:val="none"/>
+          <w:insideH w:val="single" w:color="C9D6D0" w:sz="4"/>
+          <w:insideV w:val="single" w:color="C9D6D0" w:sz="4"/>
+        </w:tblBorders>
+      </w:tblPr>
+      <w:tblGrid>
+        <w:gridCol w:w="2000"/>
+        <w:gridCol w:w="7360"/>
+      </w:tblGrid>
+      <w:tr>
+        <w:trPr>
+          <w:tblHeader/>
+        </w:trPr>
+        <w:tc>
+          <w:tcPr>
+            <w:tcW w:type="dxa" w:w="2000"/>
+            <w:shd w:fill="0B4A36" w:val="clear"/>
+            <w:tcMar>
+              <w:top w:type="dxa" w:w="90"/>
+              <w:left w:type="dxa" w:w="140"/>
+              <w:bottom w:type="dxa" w:w="90"/>
+              <w:right w:type="dxa" w:w="140"/>
+            </w:tcMar>
+          </w:tcPr>
+          <w:p>
+            <w:pPr>
+              <w:spacing w:after="0" w:line="300"/>
+            </w:pPr>
+            <w:r>
+              <w:rPr>
+                <w:b/>
+                <w:bCs/>
+                <w:color w:val="FFFFFF"/>
+                <w:sz w:val="22"/>
+                <w:szCs w:val="22"/>
+              </w:rPr>
+              <w:t xml:space="preserve">Block</w:t>
+            </w:r>
+          </w:p>
+        </w:tc>
+        <w:tc>
+          <w:tcPr>
+            <w:tcW w:type="dxa" w:w="7360"/>
+            <w:shd w:fill="0B4A36" w:val="clear"/>
+            <w:tcMar>
+              <w:top w:type="dxa" w:w="90"/>
+              <w:left w:type="dxa" w:w="140"/>
+              <w:bottom w:type="dxa" w:w="90"/>
+              <w:right w:type="dxa" w:w="140"/>
+            </w:tcMar>
+          </w:tcPr>
+          <w:p>
+            <w:pPr>
+              <w:spacing w:after="0" w:line="300"/>
+            </w:pPr>
+            <w:r>
+              <w:rPr>
+                <w:b/>
+                <w:bCs/>
+                <w:color w:val="FFFFFF"/>
+                <w:sz w:val="22"/>
+                <w:szCs w:val="22"/>
+              </w:rPr>
+              <w:t xml:space="preserve">Caixa Cheia v4</w:t>
+            </w:r>
+          </w:p>
+        </w:tc>
+      </w:tr>
+      <w:tr>
+        <w:trPr>
+          <w:tblHeader w:val="false"/>
+        </w:trPr>
+        <w:tc>
+          <w:tcPr>
+            <w:tcW w:type="dxa" w:w="2000"/>
+            <w:tcMar>
+              <w:top w:type="dxa" w:w="90"/>
+              <w:left w:type="dxa" w:w="140"/>
+              <w:bottom w:type="dxa" w:w="90"/>
+              <w:right w:type="dxa" w:w="140"/>
+            </w:tcMar>
+          </w:tcPr>
+          <w:p>
+            <w:pPr>
+              <w:spacing w:after="0" w:line="300"/>
+            </w:pPr>
+            <w:r>
+              <w:rPr>
+                <w:color w:val="141414"/>
+                <w:sz w:val="22"/>
+                <w:szCs w:val="22"/>
+              </w:rPr>
+              <w:t xml:space="preserve">Customer segments</w:t>
+            </w:r>
+          </w:p>
+        </w:tc>
+        <w:tc>
+          <w:tcPr>
+            <w:tcW w:type="dxa" w:w="7360"/>
+            <w:tcMar>
+              <w:top w:type="dxa" w:w="90"/>
+              <w:left w:type="dxa" w:w="140"/>
+              <w:bottom w:type="dxa" w:w="90"/>
+              <w:right w:type="dxa" w:w="140"/>
+            </w:tcMar>
+          </w:tcPr>
+          <w:p>
+            <w:pPr>
+              <w:spacing w:after="0" w:line="300"/>
+            </w:pPr>
+            <w:r>
+              <w:rPr>
+                <w:color w:val="141414"/>
+                <w:sz w:val="22"/>
+                <w:szCs w:val="22"/>
+              </w:rPr>
+              <w:t xml:space="preserve">Non-medical premium Brazilian beauty businesses on Trinks. Core: multi-unit groups and high-volume salons with 500+ eligible lapsed contacts, ticket ≥R$250. Ordinary premium salons: welcome self-serve volume. Excluded: medical-adjacent, low-ticket, no digital records.</w:t>
+            </w:r>
+          </w:p>
+        </w:tc>
+      </w:tr>
+      <w:tr>
+        <w:trPr>
+          <w:tblHeader w:val="false"/>
+        </w:trPr>
+        <w:tc>
+          <w:tcPr>
+            <w:tcW w:type="dxa" w:w="2000"/>
+            <w:tcMar>
+              <w:top w:type="dxa" w:w="90"/>
+              <w:left w:type="dxa" w:w="140"/>
+              <w:bottom w:type="dxa" w:w="90"/>
+              <w:right w:type="dxa" w:w="140"/>
+            </w:tcMar>
+          </w:tcPr>
+          <w:p>
+            <w:pPr>
+              <w:spacing w:after="0" w:line="300"/>
+            </w:pPr>
+            <w:r>
+              <w:rPr>
+                <w:color w:val="141414"/>
+                <w:sz w:val="22"/>
+                <w:szCs w:val="22"/>
+              </w:rPr>
+              <w:t xml:space="preserve">Value proposition</w:t>
+            </w:r>
+          </w:p>
+        </w:tc>
+        <w:tc>
+          <w:tcPr>
+            <w:tcW w:type="dxa" w:w="7360"/>
+            <w:tcMar>
+              <w:top w:type="dxa" w:w="90"/>
+              <w:left w:type="dxa" w:w="140"/>
+              <w:bottom w:type="dxa" w:w="90"/>
+              <w:right w:type="dxa" w:w="140"/>
+            </w:tcMar>
+          </w:tcPr>
+          <w:p>
+            <w:pPr>
+              <w:spacing w:after="0" w:line="300"/>
+            </w:pPr>
+            <w:r>
+              <w:rPr>
+                <w:color w:val="141414"/>
+                <w:sz w:val="22"/>
+                <w:szCs w:val="22"/>
+              </w:rPr>
+              <w:t xml:space="preserve">Done-for-you prepaid win-back: lapsed clients (90–365d) brought back with a paid offer from the salon’s own WhatsApp. Fee only on money settled through the campaign checkout; refunds reverse it. Owner approves every send.</w:t>
+            </w:r>
+          </w:p>
+        </w:tc>
+      </w:tr>
+      <w:tr>
+        <w:trPr>
+          <w:tblHeader w:val="false"/>
+        </w:trPr>
+        <w:tc>
+          <w:tcPr>
+            <w:tcW w:type="dxa" w:w="2000"/>
+            <w:tcMar>
+              <w:top w:type="dxa" w:w="90"/>
+              <w:left w:type="dxa" w:w="140"/>
+              <w:bottom w:type="dxa" w:w="90"/>
+              <w:right w:type="dxa" w:w="140"/>
+            </w:tcMar>
+          </w:tcPr>
+          <w:p>
+            <w:pPr>
+              <w:spacing w:after="0" w:line="300"/>
+            </w:pPr>
+            <w:r>
+              <w:rPr>
+                <w:color w:val="141414"/>
+                <w:sz w:val="22"/>
+                <w:szCs w:val="22"/>
+              </w:rPr>
+              <w:t xml:space="preserve">Channels</w:t>
+            </w:r>
+          </w:p>
+        </w:tc>
+        <w:tc>
+          <w:tcPr>
+            <w:tcW w:type="dxa" w:w="7360"/>
+            <w:tcMar>
+              <w:top w:type="dxa" w:w="90"/>
+              <w:left w:type="dxa" w:w="140"/>
+              <w:bottom w:type="dxa" w:w="90"/>
+              <w:right w:type="dxa" w:w="140"/>
+            </w:tcMar>
+          </w:tcPr>
+          <w:p>
+            <w:pPr>
+              <w:spacing w:after="0" w:line="300"/>
+            </w:pPr>
+            <w:r>
+              <w:rPr>
+                <w:color w:val="141414"/>
+                <w:sz w:val="22"/>
+                <w:szCs w:val="22"/>
+              </w:rPr>
+              <w:t xml:space="preserve">Free eligibility scan as the only door; Beauty Fair live tablet scans; distributors; referral ask in every winning statement; published measured results; 48h scan follow-up.</w:t>
+            </w:r>
+          </w:p>
+        </w:tc>
+      </w:tr>
+      <w:tr>
+        <w:trPr>
+          <w:tblHeader w:val="false"/>
+        </w:trPr>
+        <w:tc>
+          <w:tcPr>
+            <w:tcW w:type="dxa" w:w="2000"/>
+            <w:tcMar>
+              <w:top w:type="dxa" w:w="90"/>
+              <w:left w:type="dxa" w:w="140"/>
+              <w:bottom w:type="dxa" w:w="90"/>
+              <w:right w:type="dxa" w:w="140"/>
+            </w:tcMar>
+          </w:tcPr>
+          <w:p>
+            <w:pPr>
+              <w:spacing w:after="0" w:line="300"/>
+            </w:pPr>
+            <w:r>
+              <w:rPr>
+                <w:color w:val="141414"/>
+                <w:sz w:val="22"/>
+                <w:szCs w:val="22"/>
+              </w:rPr>
+              <w:t xml:space="preserve">Customer relationships</w:t>
+            </w:r>
+          </w:p>
+        </w:tc>
+        <w:tc>
+          <w:tcPr>
+            <w:tcW w:type="dxa" w:w="7360"/>
+            <w:tcMar>
+              <w:top w:type="dxa" w:w="90"/>
+              <w:left w:type="dxa" w:w="140"/>
+              <w:bottom w:type="dxa" w:w="90"/>
+              <w:right w:type="dxa" w:w="140"/>
+            </w:tcMar>
+          </w:tcPr>
+          <w:p>
+            <w:pPr>
+              <w:spacing w:after="0" w:line="300"/>
+            </w:pPr>
+            <w:r>
+              <w:rPr>
+                <w:color w:val="141414"/>
+                <w:sz w:val="22"/>
+                <w:szCs w:val="22"/>
+              </w:rPr>
+              <w:t xml:space="preserve">Self-serve onboarding, owner-in-command execution: manifest approval on every send, monthly statements, POS opt-in kit growing each salon’s pool. White-glove only for multi-unit groups. Invisible to end clients.</w:t>
+            </w:r>
+          </w:p>
+        </w:tc>
+      </w:tr>
+      <w:tr>
+        <w:trPr>
+          <w:tblHeader w:val="false"/>
+        </w:trPr>
+        <w:tc>
+          <w:tcPr>
+            <w:tcW w:type="dxa" w:w="2000"/>
+            <w:tcMar>
+              <w:top w:type="dxa" w:w="90"/>
+              <w:left w:type="dxa" w:w="140"/>
+              <w:bottom w:type="dxa" w:w="90"/>
+              <w:right w:type="dxa" w:w="140"/>
+            </w:tcMar>
+          </w:tcPr>
+          <w:p>
+            <w:pPr>
+              <w:spacing w:after="0" w:line="300"/>
+            </w:pPr>
+            <w:r>
+              <w:rPr>
+                <w:color w:val="141414"/>
+                <w:sz w:val="22"/>
+                <w:szCs w:val="22"/>
+              </w:rPr>
+              <w:t xml:space="preserve">Revenue streams</w:t>
+            </w:r>
+          </w:p>
+        </w:tc>
+        <w:tc>
+          <w:tcPr>
+            <w:tcW w:type="dxa" w:w="7360"/>
+            <w:tcMar>
+              <w:top w:type="dxa" w:w="90"/>
+              <w:left w:type="dxa" w:w="140"/>
+              <w:bottom w:type="dxa" w:w="90"/>
+              <w:right w:type="dxa" w:w="140"/>
+            </w:tcMar>
+          </w:tcPr>
+          <w:p>
+            <w:pPr>
+              <w:spacing w:after="0" w:line="300"/>
+            </w:pPr>
+            <w:r>
+              <w:rPr>
+                <w:color w:val="141414"/>
+                <w:sz w:val="22"/>
+                <w:szCs w:val="22"/>
+              </w:rPr>
+              <w:t xml:space="preserve">One: 20% of Asaas netValue settled through the campaign checkout, split at settlement; refunds reverse symmetrically. First 3 clients at 15%. No monthly fee, nothing off-rail. A campaign factory — backlog, then quarterly re-runs.</w:t>
+            </w:r>
+          </w:p>
+        </w:tc>
+      </w:tr>
+      <w:tr>
+        <w:trPr>
+          <w:tblHeader w:val="false"/>
+        </w:trPr>
+        <w:tc>
+          <w:tcPr>
+            <w:tcW w:type="dxa" w:w="2000"/>
+            <w:tcMar>
+              <w:top w:type="dxa" w:w="90"/>
+              <w:left w:type="dxa" w:w="140"/>
+              <w:bottom w:type="dxa" w:w="90"/>
+              <w:right w:type="dxa" w:w="140"/>
+            </w:tcMar>
+          </w:tcPr>
+          <w:p>
+            <w:pPr>
+              <w:spacing w:after="0" w:line="300"/>
+            </w:pPr>
+            <w:r>
+              <w:rPr>
+                <w:color w:val="141414"/>
+                <w:sz w:val="22"/>
+                <w:szCs w:val="22"/>
+              </w:rPr>
+              <w:t xml:space="preserve">Key resources</w:t>
+            </w:r>
+          </w:p>
+        </w:tc>
+        <w:tc>
+          <w:tcPr>
+            <w:tcW w:type="dxa" w:w="7360"/>
+            <w:tcMar>
+              <w:top w:type="dxa" w:w="90"/>
+              <w:left w:type="dxa" w:w="140"/>
+              <w:bottom w:type="dxa" w:w="90"/>
+              <w:right w:type="dxa" w:w="140"/>
+            </w:tcMar>
+          </w:tcPr>
+          <w:p>
+            <w:pPr>
+              <w:spacing w:after="0" w:line="300"/>
+            </w:pPr>
+            <w:r>
+              <w:rPr>
+                <w:color w:val="141414"/>
+                <w:sz w:val="22"/>
+                <w:szCs w:val="22"/>
+              </w:rPr>
+              <w:t xml:space="preserve">The codebase (one repo, FastAPI, Postgres+outbox) built via Claude Code; encrypted salon Asaas keys; approved template families; opt-in evidence records; manifest archive; cross-salon aggregate results + her trust position — the durable moat.</w:t>
+            </w:r>
+          </w:p>
+        </w:tc>
+      </w:tr>
+      <w:tr>
+        <w:trPr>
+          <w:tblHeader w:val="false"/>
+        </w:trPr>
+        <w:tc>
+          <w:tcPr>
+            <w:tcW w:type="dxa" w:w="2000"/>
+            <w:tcMar>
+              <w:top w:type="dxa" w:w="90"/>
+              <w:left w:type="dxa" w:w="140"/>
+              <w:bottom w:type="dxa" w:w="90"/>
+              <w:right w:type="dxa" w:w="140"/>
+            </w:tcMar>
+          </w:tcPr>
+          <w:p>
+            <w:pPr>
+              <w:spacing w:after="0" w:line="300"/>
+            </w:pPr>
+            <w:r>
+              <w:rPr>
+                <w:color w:val="141414"/>
+                <w:sz w:val="22"/>
+                <w:szCs w:val="22"/>
+              </w:rPr>
+              <w:t xml:space="preserve">Key activities</w:t>
+            </w:r>
+          </w:p>
+        </w:tc>
+        <w:tc>
+          <w:tcPr>
+            <w:tcW w:type="dxa" w:w="7360"/>
+            <w:tcMar>
+              <w:top w:type="dxa" w:w="90"/>
+              <w:left w:type="dxa" w:w="140"/>
+              <w:bottom w:type="dxa" w:w="90"/>
+              <w:right w:type="dxa" w:w="140"/>
+            </w:tcMar>
+          </w:tcPr>
+          <w:p>
+            <w:pPr>
+              <w:spacing w:after="0" w:line="300"/>
+            </w:pPr>
+            <w:r>
+              <w:rPr>
+                <w:color w:val="141414"/>
+                <w:sz w:val="22"/>
+                <w:szCs w:val="22"/>
+              </w:rPr>
+              <w:t xml:space="preserve">Eligibility scans; offer gallery curation; template drafting/approval; manifest-gated sending; settlement/refund/quality monitoring; statements + NFS-e; POS opt-in capture; Friday five-number review; provider approvals maintained.</w:t>
+            </w:r>
+          </w:p>
+        </w:tc>
+      </w:tr>
+      <w:tr>
+        <w:trPr>
+          <w:tblHeader w:val="false"/>
+        </w:trPr>
+        <w:tc>
+          <w:tcPr>
+            <w:tcW w:type="dxa" w:w="2000"/>
+            <w:tcMar>
+              <w:top w:type="dxa" w:w="90"/>
+              <w:left w:type="dxa" w:w="140"/>
+              <w:bottom w:type="dxa" w:w="90"/>
+              <w:right w:type="dxa" w:w="140"/>
+            </w:tcMar>
+          </w:tcPr>
+          <w:p>
+            <w:pPr>
+              <w:spacing w:after="0" w:line="300"/>
+            </w:pPr>
+            <w:r>
+              <w:rPr>
+                <w:color w:val="141414"/>
+                <w:sz w:val="22"/>
+                <w:szCs w:val="22"/>
+              </w:rPr>
+              <w:t xml:space="preserve">Key partners</w:t>
+            </w:r>
+          </w:p>
+        </w:tc>
+        <w:tc>
+          <w:tcPr>
+            <w:tcW w:type="dxa" w:w="7360"/>
+            <w:tcMar>
+              <w:top w:type="dxa" w:w="90"/>
+              <w:left w:type="dxa" w:w="140"/>
+              <w:bottom w:type="dxa" w:w="90"/>
+              <w:right w:type="dxa" w:w="140"/>
+            </w:tcMar>
+          </w:tcPr>
+          <w:p>
+            <w:pPr>
+              <w:spacing w:after="0" w:line="300"/>
+            </w:pPr>
+            <w:r>
+              <w:rPr>
+                <w:color w:val="141414"/>
+                <w:sz w:val="22"/>
+                <w:szCs w:val="22"/>
+              </w:rPr>
+              <w:t xml:space="preserve">Asaas (salon-owned accounts, split, written classification); Meta/BSP (coexistence, templates); Trinks (data source — a dependency to manage); contador + lawyer; fair distributors; the 3 founding testimonial salons.</w:t>
+            </w:r>
+          </w:p>
+        </w:tc>
+      </w:tr>
+      <w:tr>
+        <w:trPr>
+          <w:tblHeader w:val="false"/>
+        </w:trPr>
+        <w:tc>
+          <w:tcPr>
+            <w:tcW w:type="dxa" w:w="2000"/>
+            <w:tcMar>
+              <w:top w:type="dxa" w:w="90"/>
+              <w:left w:type="dxa" w:w="140"/>
+              <w:bottom w:type="dxa" w:w="90"/>
+              <w:right w:type="dxa" w:w="140"/>
+            </w:tcMar>
+          </w:tcPr>
+          <w:p>
+            <w:pPr>
+              <w:spacing w:after="0" w:line="300"/>
+            </w:pPr>
+            <w:r>
+              <w:rPr>
+                <w:color w:val="141414"/>
+                <w:sz w:val="22"/>
+                <w:szCs w:val="22"/>
+              </w:rPr>
+              <w:t xml:space="preserve">Cost structure</w:t>
+            </w:r>
+          </w:p>
+        </w:tc>
+        <w:tc>
+          <w:tcPr>
+            <w:tcW w:type="dxa" w:w="7360"/>
+            <w:tcMar>
+              <w:top w:type="dxa" w:w="90"/>
+              <w:left w:type="dxa" w:w="140"/>
+              <w:bottom w:type="dxa" w:w="90"/>
+              <w:right w:type="dxa" w:w="140"/>
+            </w:tcMar>
+          </w:tcPr>
+          <w:p>
+            <w:pPr>
+              <w:spacing w:after="0" w:line="300"/>
+            </w:pPr>
+            <w:r>
+              <w:rPr>
+                <w:color w:val="141414"/>
+                <w:sz w:val="22"/>
+                <w:szCs w:val="22"/>
+              </w:rPr>
+              <w:t xml:space="preserve">Fixed ~R$1.5–3k/month solo (contador, tools, infra, WhatsApp conversation fees, Asaas per-charge). Scaling cost: campaign ops — her time, then the gated ops hire. Taxes: Anexo III effective ~16% at scale; 10% dividend WHT above R$50k/month.</w:t>
+            </w:r>
+          </w:p>
+        </w:tc>
+      </w:tr>
+    </w:tbl>
+    <w:p>
+      <w:pPr>
+        <w:spacing w:after="60"/>
+      </w:pPr>
+    </w:p>
+    <w:p>
+      <w:pPr>
         <w:spacing w:after="160" w:line="360"/>
       </w:pPr>
       <w:r>
@@ -1007,7 +1632,7 @@
           <w:bCs/>
           <w:color w:val="0B4A36"/>
         </w:rPr>
-        <w:t xml:space="preserve">§1 · v2 → v4: two errors and sixteen cuts</w:t>
+        <w:t xml:space="preserve">§1 · v2 → v4: two errors and the cut ledger</w:t>
       </w:r>
     </w:p>
     <w:p>
@@ -1056,21 +1681,21 @@
         <w:rPr>
           <w:color w:val="141414"/>
         </w:rPr>
-        <w:t xml:space="preserve"> (a contract liability). Charging a “recovery fee” when that client redeems a session would be charging the salon a fee on money it received months ago. Dead on arrival at the first accountant. The bucket dies as a fee event forever; dormant package clients survive as reactivation </w:t>
-      </w:r>
-      <w:r>
-        <w:rPr>
-          <w:b/>
-          <w:bCs/>
-          <w:color w:val="141414"/>
-        </w:rPr>
-        <w:t xml:space="preserve">targets</w:t>
-      </w:r>
-      <w:r>
-        <w:rPr>
-          <w:color w:val="141414"/>
-        </w:rPr>
-        <w:t xml:space="preserve"> — the fee applies only to NEW prepaid money they spend through the campaign checkout.</w:t>
+        <w:t xml:space="preserve"> (a contract liability). Charging a “recovery fee” when that client redeems a session would be charging the salon a fee on money it received months ago. Dead on arrival at the first accountant. The bucket dies as a fee event forever; clients with unused prepaid sessions are </w:t>
+      </w:r>
+      <w:r>
+        <w:rPr>
+          <w:b/>
+          <w:bCs/>
+          <w:color w:val="141414"/>
+        </w:rPr>
+        <w:t xml:space="preserve">excluded from campaigns until their credit is honored</w:t>
+      </w:r>
+      <w:r>
+        <w:rPr>
+          <w:color w:val="141414"/>
+        </w:rPr>
+        <w:t xml:space="preserve"> — only then do they re-enter the eligible pool, and the fee applies only to NEW prepaid money settled through the campaign checkout.</w:t>
       </w:r>
     </w:p>
     <w:p>
@@ -1637,74 +2262,13 @@
     </w:p>
     <w:p>
       <w:pPr>
-        <w:pStyle w:val="ListParagraph"/>
-        <w:numPr>
-          <w:ilvl w:val="0"/>
-          <w:numId w:val="2"/>
-        </w:numPr>
-        <w:spacing w:after="100" w:line="340"/>
-      </w:pPr>
-      <w:r>
-        <w:rPr>
-          <w:b/>
-          <w:bCs/>
-          <w:color w:val="141414"/>
-        </w:rPr>
-        <w:t xml:space="preserve">First-party payment reminders (phase 2): </w:t>
-      </w:r>
-      <w:r>
-        <w:rPr>
-          <w:color w:val="141414"/>
-        </w:rPr>
-        <w:t xml:space="preserve">a salon reminding its own client about its own transaction is standard utility-template practice across Brazilian billing. Gate: written BSP/Meta guidance first, separate template category, never “collections” branding. A decision gate, not a roadmap promise.</w:t>
-      </w:r>
-    </w:p>
-    <w:p>
-      <w:pPr>
-        <w:pStyle w:val="ListParagraph"/>
-        <w:numPr>
-          <w:ilvl w:val="0"/>
-          <w:numId w:val="2"/>
-        </w:numPr>
-        <w:spacing w:after="100" w:line="340"/>
-      </w:pPr>
-      <w:r>
-        <w:rPr>
-          <w:b/>
-          <w:bCs/>
-          <w:color w:val="141414"/>
-        </w:rPr>
-        <w:t xml:space="preserve">Active-base campaigns (phase 2): </w:t>
-      </w:r>
-      <w:r>
-        <w:rPr>
-          <w:color w:val="141414"/>
-        </w:rPr>
-        <w:t xml:space="preserve">renewals, upsells and seasonal offers to the salon’s ACTIVE clients — identical machinery, much bigger pool. The natural expansion once win-back telemetry exists.</w:t>
-      </w:r>
-    </w:p>
-    <w:p>
-      <w:pPr>
-        <w:pStyle w:val="ListParagraph"/>
-        <w:numPr>
-          <w:ilvl w:val="0"/>
-          <w:numId w:val="2"/>
-        </w:numPr>
-        <w:spacing w:after="100" w:line="340"/>
-      </w:pPr>
-      <w:r>
-        <w:rPr>
-          <w:b/>
-          <w:bCs/>
-          <w:color w:val="141414"/>
-        </w:rPr>
-        <w:t xml:space="preserve">Belasis/Avec importers: </w:t>
-      </w:r>
-      <w:r>
-        <w:rPr>
-          <w:color w:val="141414"/>
-        </w:rPr>
-        <w:t xml:space="preserve">built the first time a real signed prospect demands one — never speculatively.</w:t>
+        <w:spacing w:after="160" w:line="360"/>
+      </w:pPr>
+      <w:r>
+        <w:rPr>
+          <w:color w:val="141414"/>
+        </w:rPr>
+        <w:t xml:space="preserve">Three cuts return later, behind the evidence gates of §15: first-party payment reminders, active-base campaigns, and a second importer (Belasis/Avec) — each opened by proof, never by calendar.</w:t>
       </w:r>
     </w:p>
     <w:p>
@@ -1956,7 +2520,7 @@
                 <w:iCs/>
                 <w:color w:val="0A6E4C"/>
               </w:rPr>
-              <w:t xml:space="preserve">"Você tem 612 clientes sumidas há mais de 90 dias que a gente pode contatar direitinho (com opt-in comprovado: 214). Ticket médio delas: R$310. Uma campanha típica converte 8–15%. Quer rodar a primeira? Você só paga 20% do que efetivamente entrar pelo link."</w:t>
+              <w:t xml:space="preserve">"Você tem 612 clientes sumidas há mais de 90 dias; 214 delas têm opt-in comprovado — só essas a gente pode contatar. Ticket médio delas: R$310 · potencial da campanha: ~R$8 mil. Quer rodar a primeira? Você só paga 20% do que efetivamente entrar pelo link."</w:t>
             </w:r>
           </w:p>
         </w:tc>
@@ -1975,7 +2539,7 @@
         <w:rPr>
           <w:color w:val="141414"/>
         </w:rPr>
-        <w:t xml:space="preserve">The scan runs the same importer, eligibility engine and opt-in gate the product uses — zero extra machinery, and it doubles as qualification: it reveals the real contactable pool (the opt-in number) before anyone commits to anything. Small pool → honest advice and a POS opt-in kit, not a campaign. This is also the live demo for the Beauty Fair: scan a prospect’s file at the stand, show her the number.</w:t>
+        <w:t xml:space="preserve">The scan runs the same importer, eligibility engine and opt-in gate the product uses — zero extra machinery, and it doubles as qualification: it reveals the real contactable pool (the opt-in number) before anyone commits to anything; a prospect’s file runs in the same production app as a tenant-to-be, and if she doesn’t sign, her row-level data is deleted after the scan (only the summary counts survive). Small pool → honest advice and a POS opt-in kit, not a campaign. This is also the live demo for the Beauty Fair: scan a prospect’s file on the spot, show her the number.</w:t>
       </w:r>
     </w:p>
     <w:p>
@@ -2042,7 +2606,7 @@
         <w:rPr>
           <w:color w:val="141414"/>
         </w:rPr>
-        <w:t xml:space="preserve">a concrete prepaid deal chosen with the owner — a discounted return package, a “volta com a gente” bundle, or a booking-with-deposit. All formats settle through the same campaign checkout. The deposit format doubles as the salon’s no-show protection — an offer type, not a separate product.</w:t>
+        <w:t xml:space="preserve">a concrete prepaid deal the owner picks from a gallery of three proven formats with editable defaults — a discounted return package, a “volta com a gente” bundle, or a booking-with-deposit; offers are designed personally with her only in the white-glove tier (multi-unit groups). All formats settle through the same campaign checkout. The deposit format doubles as the salon’s no-show protection — an offer type, not a separate product.</w:t>
       </w:r>
     </w:p>
     <w:p>
@@ -2090,7 +2654,7 @@
         <w:rPr>
           <w:color w:val="141414"/>
         </w:rPr>
-        <w:t xml:space="preserve">before sending, the owner sees the exact final payload — every recipient, the exact rendered copy, every link — and approves. Manifest + approver + timestamp + hash stored immutably. What was sent is never in dispute; what the salon authorized is never in dispute.</w:t>
+        <w:t xml:space="preserve">before sending, the owner sees the exact final payload — every recipient, the exact rendered copy, every link — and approves. Manifest + approver + timestamp + hash stored. What was sent is never in dispute; what the salon authorized is never in dispute.</w:t>
       </w:r>
     </w:p>
     <w:p>
@@ -2220,7 +2784,121 @@
         <w:rPr>
           <w:color w:val="141414"/>
         </w:rPr>
-        <w:t xml:space="preserve">(1) one real charge + refund through a salon-owned account with the split, in production, plus Asaas’s written classification of the topology; (2) coexistence onboarding working on one real salon number. Both start day 1 — provider approvals run parallel to the build.</w:t>
+        <w:t xml:space="preserve">(1) one real charge + refund through a salon-owned account with the split, in production, plus Asaas’s written classification of the topology; (2) coexistence onboarding — via Meta’s embedded-signup flow — working on one real salon number, completable by a non-technical owner. Both start day 1 — provider approvals run parallel to the build.</w:t>
+      </w:r>
+    </w:p>
+    <w:p>
+      <w:pPr>
+        <w:spacing w:after="60"/>
+      </w:pPr>
+    </w:p>
+    <w:p>
+      <w:pPr>
+        <w:pStyle w:val="Heading1"/>
+        <w:spacing w:after="200" w:before="360"/>
+      </w:pPr>
+      <w:r>
+        <w:rPr>
+          <w:b/>
+          <w:bCs/>
+          <w:color w:val="0B4A36"/>
+        </w:rPr>
+        <w:t xml:space="preserve">§7 · Self-service by design — 100+ salons a month</w:t>
+      </w:r>
+    </w:p>
+    <w:p>
+      <w:pPr>
+        <w:spacing w:after="160" w:line="360"/>
+      </w:pPr>
+      <w:r>
+        <w:rPr>
+          <w:b/>
+          <w:bCs/>
+          <w:color w:val="141414"/>
+        </w:rPr>
+        <w:t xml:space="preserve">The principle: self-service to enter, done-for-you to run. </w:t>
+      </w:r>
+      <w:r>
+        <w:rPr>
+          <w:color w:val="141414"/>
+        </w:rPr>
+        <w:t xml:space="preserve">The thesis of this business is that owners don’t press buttons — so the owner is never asked to OPERATE anything. What is self-service is the entry and the control surface; the work stays with the machine. Her total lifetime effort: ~15 minutes once, then two taps per campaign.</w:t>
+      </w:r>
+    </w:p>
+    <w:p>
+      <w:pPr>
+        <w:spacing w:after="160" w:line="360"/>
+      </w:pPr>
+      <w:r>
+        <w:rPr>
+          <w:b/>
+          <w:bCs/>
+          <w:color w:val="141414"/>
+        </w:rPr>
+        <w:t xml:space="preserve">The 15-minute onboarding (zero founder minutes on the happy path): </w:t>
+      </w:r>
+      <w:r>
+        <w:rPr>
+          <w:color w:val="141414"/>
+        </w:rPr>
+        <w:t xml:space="preserve">(1) sign up from a link — distributor, content, or fair QR — with CNPJ + WhatsApp; (2) upload the Trinks CSV following a 40-second video → the eligibility scan renders on screen instantly; (3) accept the contract + DPA by clickwrap; (4) connect Asaas through a guided flow (their own account, their API key, video-led); (5) connect WhatsApp via Meta’s embedded-signup for coexistence; (6) pick an offer from the gallery and approve the manifest. The campaign runs.</w:t>
+      </w:r>
+    </w:p>
+    <w:p>
+      <w:pPr>
+        <w:spacing w:after="160" w:line="360"/>
+      </w:pPr>
+      <w:r>
+        <w:rPr>
+          <w:b/>
+          <w:bCs/>
+          <w:color w:val="141414"/>
+        </w:rPr>
+        <w:t xml:space="preserve">Throughput math: </w:t>
+      </w:r>
+      <w:r>
+        <w:rPr>
+          <w:color w:val="141414"/>
+        </w:rPr>
+        <w:t xml:space="preserve">100 salons/month is 5 per business day. The happy path costs the founder zero minutes; budgeting ~20% exceptions at ~15 minutes each is ~4 hours a week of exception handling at full flow. Support is help videos + an async WhatsApp line — no live onboarding calls on the self-serve tier. Her personal first-campaign review is sampled after account #50, once the template linter has fifty clean campaigns behind it; the owner’s manifest approval — the accountability gate — never goes away.</w:t>
+      </w:r>
+    </w:p>
+    <w:p>
+      <w:pPr>
+        <w:spacing w:after="160" w:line="360"/>
+      </w:pPr>
+      <w:r>
+        <w:rPr>
+          <w:b/>
+          <w:bCs/>
+          <w:color w:val="141414"/>
+        </w:rPr>
+        <w:t xml:space="preserve">The two-tier motion this creates: </w:t>
+      </w:r>
+      <w:r>
+        <w:rPr>
+          <w:color w:val="141414"/>
+        </w:rPr>
+        <w:t xml:space="preserve">self-serve for ordinary salons — which answers the economics honestly: at R$150–250/month steady they are only worth serving when servicing costs ~zero, and now it does, so the long tail becomes profitable volume and the referral engine; white-glove for multi-unit groups — the core revenue ICP still gets her personally, five conversations a month instead of a hundred.</w:t>
+      </w:r>
+    </w:p>
+    <w:p>
+      <w:pPr>
+        <w:spacing w:after="160" w:line="360"/>
+      </w:pPr>
+      <w:r>
+        <w:rPr>
+          <w:b/>
+          <w:bCs/>
+          <w:color w:val="141414"/>
+        </w:rPr>
+        <w:t xml:space="preserve">Honest sequencing: </w:t>
+      </w:r>
+      <w:r>
+        <w:rPr>
+          <w:color w:val="141414"/>
+        </w:rPr>
+        <w:t xml:space="preserve">the architecture is self-service-first from day 1, but for the first ~20 accounts she drives the same screens herself (concierge mode) — that is how the flow gets debugged. Public self-serve opens in month 2–3 once telemetry proves the happy path. Same code, zero rework. Two proofs join the launch-blocking list: the embedded-signup path works for a non-technical owner, and the guided Asaas connect survives contact with a real one.</w:t>
       </w:r>
     </w:p>
     <w:p>
@@ -2305,7 +2983,7 @@
           <w:bCs/>
           <w:color w:val="0B4A36"/>
         </w:rPr>
-        <w:t xml:space="preserve">§7 · Architecture</w:t>
+        <w:t xml:space="preserve">§8 · Architecture</w:t>
       </w:r>
     </w:p>
     <w:p>
@@ -2495,7 +3173,7 @@
                 <w:sz w:val="22"/>
                 <w:szCs w:val="22"/>
               </w:rPr>
-              <w:t xml:space="preserve">Computes lapse (90–365d), applies exclusions (active booking, dispute, debt, unused prepaid sessions), enforces the opt-in evidence gate: opt_in + captured_at + source, or no send.</w:t>
+              <w:t xml:space="preserve">Computes lapse (90–365d), applies exclusions (active booking, dispute, debt, unused prepaid sessions), enforces the opt-in evidence gate: value + captured_at + source + scope, or no send.</w:t>
             </w:r>
           </w:p>
         </w:tc>
@@ -2548,7 +3226,7 @@
                 <w:sz w:val="22"/>
                 <w:szCs w:val="22"/>
               </w:rPr>
-              <w:t xml:space="preserve">Offer setup, recipient selection, template rendering with deterministic variables, the manifest approval gate, outbox-driven sending with retry + idempotency, opt-out suppression.</w:t>
+              <w:t xml:space="preserve">Offer setup, recipient selection, template rendering with deterministic variables, the manifest approval gate, outbox-driven sending with retry + idempotency, opt-out suppression, and the WhatsApp webhook (signature-validated) that records delivery status, number-quality signals and every opt-out reply into a per-tenant suppression list — suppressed forever, checked at manifest build and again at send.</w:t>
             </w:r>
           </w:p>
         </w:tc>
@@ -2601,7 +3279,60 @@
                 <w:sz w:val="22"/>
                 <w:szCs w:val="22"/>
               </w:rPr>
-              <w:t xml:space="preserve">Asaas charge creation in the salon’s account, split rule, payment/refund/chargeback webhooks (idempotent, replay-safe), revenue ledger, salon statement, NFS-e export.</w:t>
+              <w:t xml:space="preserve">Asaas charge creation in the salon’s account (idempotent — one charge per manifest recipient, keyed by externalReference, so a retried job can never double-charge), split rule, payment/refund/chargeback webhooks (token-validated, idempotent, replay-safe — an unauthenticated or replayed event changes nothing), revenue ledger, salon statement, NFS-e export.</w:t>
+            </w:r>
+          </w:p>
+        </w:tc>
+      </w:tr>
+      <w:tr>
+        <w:trPr>
+          <w:tblHeader w:val="false"/>
+        </w:trPr>
+        <w:tc>
+          <w:tcPr>
+            <w:tcW w:type="dxa" w:w="2600"/>
+            <w:tcMar>
+              <w:top w:type="dxa" w:w="90"/>
+              <w:left w:type="dxa" w:w="140"/>
+              <w:bottom w:type="dxa" w:w="90"/>
+              <w:right w:type="dxa" w:w="140"/>
+            </w:tcMar>
+          </w:tcPr>
+          <w:p>
+            <w:pPr>
+              <w:spacing w:after="0" w:line="300"/>
+            </w:pPr>
+            <w:r>
+              <w:rPr>
+                <w:color w:val="141414"/>
+                <w:sz w:val="22"/>
+                <w:szCs w:val="22"/>
+              </w:rPr>
+              <w:t xml:space="preserve">Onboarding portal</w:t>
+            </w:r>
+          </w:p>
+        </w:tc>
+        <w:tc>
+          <w:tcPr>
+            <w:tcW w:type="dxa" w:w="6760"/>
+            <w:tcMar>
+              <w:top w:type="dxa" w:w="90"/>
+              <w:left w:type="dxa" w:w="140"/>
+              <w:bottom w:type="dxa" w:w="90"/>
+              <w:right w:type="dxa" w:w="140"/>
+            </w:tcMar>
+          </w:tcPr>
+          <w:p>
+            <w:pPr>
+              <w:spacing w:after="0" w:line="300"/>
+            </w:pPr>
+            <w:r>
+              <w:rPr>
+                <w:color w:val="141414"/>
+                <w:sz w:val="22"/>
+                <w:szCs w:val="22"/>
+              </w:rPr>
+              <w:t xml:space="preserve">Self-serve: signup, clickwrap contract + DPA, CSV upload → instant scan, guided Asaas connect (encrypted API key), Meta embedded-signup for coexistence, offer gallery. Concierge-driven for the first ~20 accounts, public once the flow is proven.</w:t>
             </w:r>
           </w:p>
         </w:tc>
@@ -2760,7 +3491,7 @@
               <w:rPr>
                 <w:color w:val="141414"/>
               </w:rPr>
-              <w:t xml:space="preserve">The owner approves the exact manifest; she reviews each account’s first campaign. Automation does labour, never accountability.</w:t>
+              <w:t xml:space="preserve">The owner approves the exact manifest; she reviews each account’s first campaign, sampled after account #50. Automation does labour, never accountability.</w:t>
             </w:r>
           </w:p>
         </w:tc>
@@ -2782,7 +3513,7 @@
           <w:bCs/>
           <w:color w:val="0B4A36"/>
         </w:rPr>
-        <w:t xml:space="preserve">§8 · LGPD posture — narrow by construction</w:t>
+        <w:t xml:space="preserve">§9 · LGPD posture — narrow by construction</w:t>
       </w:r>
     </w:p>
     <w:p>
@@ -2931,7 +3662,7 @@
           <w:bCs/>
           <w:color w:val="0B4A36"/>
         </w:rPr>
-        <w:t xml:space="preserve">§9 · Per-account economics, corrected</w:t>
+        <w:t xml:space="preserve">§10 · Per-account economics, corrected</w:t>
       </w:r>
     </w:p>
     <w:p>
@@ -3257,7 +3988,7 @@
           <w:bCs/>
           <w:color w:val="0B4A36"/>
         </w:rPr>
-        <w:t xml:space="preserve">§10 · Taxes and the target, without flattering herself</w:t>
+        <w:t xml:space="preserve">§11 · Taxes and the target, without flattering herself</w:t>
       </w:r>
     </w:p>
     <w:p>
@@ -3273,7 +4004,7 @@
         <w:rPr>
           <w:color w:val="141414"/>
         </w:rPr>
-        <w:t xml:space="preserve">Simples Anexo III starts near 6% but is progressive: at R$2.4–2.8M annualized, the effective rate approaches ~16% — and holding Fator R at 28% of revenue would demand an unrealistic payroll at scale. Model with Anexo V / effective ~15–17% beyond the first bands and let the contador optimize, not the plan.</w:t>
+        <w:t xml:space="preserve">Simples Anexo III starts near 6% but is progressive: at R$2.4–2.8M annualized, the effective rate approaches ~16% — and holding Fator R at 28% of revenue would demand an unrealistic payroll at scale. Model with the Anexo III fifth-band effective (~16%) as the base case, treat a fall into Anexo V (effective ~19–21% beyond the first bands) as the downside when Fator R fails, and let the contador optimize, not the plan.</w:t>
       </w:r>
     </w:p>
     <w:p>
@@ -3439,7 +4170,7 @@
           <w:bCs/>
           <w:color w:val="0B4A36"/>
         </w:rPr>
-        <w:t xml:space="preserve">§11 · The build (production product, not an MVP)</w:t>
+        <w:t xml:space="preserve">§12 · The build (production product, not an MVP)</w:t>
       </w:r>
     </w:p>
     <w:tbl>
@@ -3617,7 +4348,7 @@
                 <w:sz w:val="22"/>
                 <w:szCs w:val="22"/>
               </w:rPr>
-              <w:t xml:space="preserve">A real Trinks export is accepted; forbidden columns provably discarded; a non-opted-in row cannot enter a wave</w:t>
+              <w:t xml:space="preserve">A real Trinks export is accepted; forbidden columns provably discarded; a non-opted-in row cannot enter a campaign</w:t>
             </w:r>
           </w:p>
         </w:tc>
@@ -3694,7 +4425,7 @@
                 <w:sz w:val="22"/>
                 <w:szCs w:val="22"/>
               </w:rPr>
-              <w:t xml:space="preserve">Coexistence live on one real salon number; owner approves an exact manifest; opt-out suppresses instantly</w:t>
+              <w:t xml:space="preserve">Coexistence proven end-to-end, live on the real salon number the day Meta verification clears (the clock started day 1 — week 2 is the target, launch is the gate); owner approves an exact manifest; opt-out suppresses instantly</w:t>
             </w:r>
           </w:p>
         </w:tc>
@@ -3870,7 +4601,7 @@
           <w:bCs/>
           <w:color w:val="0B4A36"/>
         </w:rPr>
-        <w:t xml:space="preserve">§12 · The 90 days</w:t>
+        <w:t xml:space="preserve">§13 · The 90 days</w:t>
       </w:r>
     </w:p>
     <w:tbl>
@@ -4024,7 +4755,7 @@
                 <w:sz w:val="22"/>
                 <w:szCs w:val="22"/>
               </w:rPr>
-              <w:t xml:space="preserve">Build (above) · recruit 2–3 friendly salons for the first real campaigns (15% case-study fee, testimonial in writing) · Beauty Fair prep: live eligibility-scan demo on a tablet</w:t>
+              <w:t xml:space="preserve">Build (above) · recruit the first 3 client salons for the first real campaigns (the first 3 clients at the 15% case-study fee, testimonial in writing) · Beauty Fair prep: live eligibility-scan demo on a tablet</w:t>
             </w:r>
           </w:p>
         </w:tc>
@@ -4101,7 +4832,7 @@
                 <w:sz w:val="22"/>
                 <w:szCs w:val="22"/>
               </w:rPr>
-              <w:t xml:space="preserve">No booth. Live scans at the stand: “manda seu CSV, te digo agora quantas clientes dá pra trazer de volta.” 10 distributor relationships. Close campaign #1 for 5–10 salons on the spot.</w:t>
+              <w:t xml:space="preserve">No booth. Live scans on a tablet: “manda seu CSV, te digo agora quantas clientes dá pra trazer de volta.” 10 distributor relationships. Close campaign #1 for 5–10 salons on the spot.</w:t>
             </w:r>
           </w:p>
         </w:tc>
@@ -4125,7 +4856,7 @@
                 <w:sz w:val="22"/>
                 <w:szCs w:val="22"/>
               </w:rPr>
-              <w:t xml:space="preserve">A pipeline of scanned, quantified prospects — each already holding their own number</w:t>
+              <w:t xml:space="preserve">A pipeline of scanned, quantified prospects — each already holding their scan result</w:t>
             </w:r>
           </w:p>
         </w:tc>
@@ -4154,7 +4885,7 @@
                 <w:sz w:val="22"/>
                 <w:szCs w:val="22"/>
               </w:rPr>
-              <w:t xml:space="preserve">Sep 9 – Oct 23</w:t>
+              <w:t xml:space="preserve">Sep 9 – Oct 29</w:t>
             </w:r>
           </w:p>
         </w:tc>
@@ -4224,7 +4955,7 @@
           <w:bCs/>
           <w:color w:val="0B4A36"/>
         </w:rPr>
-        <w:t xml:space="preserve">§13 · Operating it KISS</w:t>
+        <w:t xml:space="preserve">§14 · Operating it KISS</w:t>
       </w:r>
     </w:p>
     <w:p>
@@ -4290,7 +5021,7 @@
         <w:rPr>
           <w:color w:val="141414"/>
         </w:rPr>
-        <w:t xml:space="preserve">number quality rating drops → pause that account’s sends, review the template and audience. Refund rate &gt;5% → redesign the offer, not the copy. Campaign conversion &lt;5% twice → change the offer economics with the owner. Opt-in pool stagnant → push the POS capture kit before selling anything else. Every tripwire is visible on the dashboard before any client feels it.</w:t>
+        <w:t xml:space="preserve">number quality rating drops → pause that account’s sends, review the template and audience. Refund rate &gt;5% → redesign the offer, not the copy. Campaign conversion &lt;5% twice → change the offer economics with the owner. Opt-in pool stagnant → push the POS opt-in kit before selling anything else. Every tripwire is visible on the dashboard before any client feels it.</w:t>
       </w:r>
     </w:p>
     <w:p>
@@ -4375,7 +5106,7 @@
           <w:bCs/>
           <w:color w:val="0B4A36"/>
         </w:rPr>
-        <w:t xml:space="preserve">§14 · Phase-2 gates (opened by evidence, never by calendar)</w:t>
+        <w:t xml:space="preserve">§15 · Phase-2 gates (opened by evidence, never by calendar)</w:t>
       </w:r>
     </w:p>
     <w:p>
@@ -4490,7 +5221,7 @@
           <w:bCs/>
           <w:color w:val="0B4A36"/>
         </w:rPr>
-        <w:t xml:space="preserve">§15 · The endgame asset</w:t>
+        <w:t xml:space="preserve">§16 · The endgame asset</w:t>
       </w:r>
     </w:p>
     <w:p>
@@ -4504,87 +5235,6 @@
         <w:t xml:space="preserve">After 24 months of campaigns she owns the only dataset of its kind: measured win-back conversion by offer type, segment, ticket and season across hundreds of Brazilian beauty businesses — plus the trust position of the operator who only ever charged for money that landed. That funds the expansions (active-base campaigns, adjacent verticals with the same cadence shape) from a position of evidence, not hope. The moat was never the code; it is the results ledger and the name.</w:t>
       </w:r>
     </w:p>
-    <w:p>
-      <w:pPr>
-        <w:spacing w:after="60"/>
-      </w:pPr>
-    </w:p>
-    <w:tbl>
-      <w:tblPr>
-        <w:tblW w:type="dxa" w:w="9360"/>
-        <w:tblBorders>
-          <w:top w:val="none"/>
-          <w:left w:val="single" w:color="1D6B4F" w:sz="24"/>
-          <w:bottom w:val="none"/>
-          <w:right w:val="none"/>
-          <w:insideH w:val="none"/>
-          <w:insideV w:val="none"/>
-        </w:tblBorders>
-      </w:tblPr>
-      <w:tblGrid>
-        <w:gridCol w:w="9360"/>
-      </w:tblGrid>
-      <w:tr>
-        <w:tc>
-          <w:tcPr>
-            <w:tcW w:type="dxa" w:w="9360"/>
-            <w:shd w:fill="EEF5F1" w:val="clear"/>
-            <w:tcMar>
-              <w:top w:type="dxa" w:w="140"/>
-              <w:left w:type="dxa" w:w="220"/>
-              <w:bottom w:type="dxa" w:w="140"/>
-              <w:right w:type="dxa" w:w="220"/>
-            </w:tcMar>
-          </w:tcPr>
-          <w:p>
-            <w:pPr>
-              <w:spacing w:after="160" w:line="360"/>
-            </w:pPr>
-            <w:r>
-              <w:rPr>
-                <w:b/>
-                <w:bCs/>
-                <w:color w:val="0B4A36"/>
-              </w:rPr>
-              <w:t xml:space="preserve">The three sentences, final form. </w:t>
-            </w:r>
-          </w:p>
-          <w:p>
-            <w:pPr>
-              <w:spacing w:after="160" w:line="360"/>
-            </w:pPr>
-            <w:r>
-              <w:rPr>
-                <w:color w:val="141414"/>
-              </w:rPr>
-              <w:t xml:space="preserve">“Eu trago suas clientes de volta — com oferta paga, não com promessa.”</w:t>
-            </w:r>
-          </w:p>
-          <w:p>
-            <w:pPr>
-              <w:spacing w:after="160" w:line="360"/>
-            </w:pPr>
-            <w:r>
-              <w:rPr>
-                <w:color w:val="141414"/>
-              </w:rPr>
-              <w:t xml:space="preserve">“Você paga 20% só do que entrar pelo link da campanha.”</w:t>
-            </w:r>
-          </w:p>
-          <w:p>
-            <w:pPr>
-              <w:spacing w:after="160" w:line="360"/>
-            </w:pPr>
-            <w:r>
-              <w:rPr>
-                <w:color w:val="141414"/>
-              </w:rPr>
-              <w:t xml:space="preserve">“Estornou? Nossa taxa volta junto.”</w:t>
-            </w:r>
-          </w:p>
-        </w:tc>
-      </w:tr>
-    </w:tbl>
     <w:sectPr>
       <w:footerReference w:type="default" r:id="rId7"/>
       <w:pgSz w:w="12240" w:h="15840" w:orient="portrait"/>

</xml_diff>